<commit_message>
Align reboot docs and GitHub readiness state
</commit_message>
<xml_diff>
--- a/DUNGEON_DIVE_APP_NEEDS_2026-04-14.docx
+++ b/DUNGEON_DIVE_APP_NEEDS_2026-04-14.docx
@@ -27,7 +27,7 @@
     <w:p/>
     <w:p>
       <w:r>
-        <w:t xml:space="preserve">- release-candidate hardening still holds</w:t>
+        <w:t xml:space="preserve">- controlled partial restart is in progress</w:t>
       </w:r>
     </w:p>
     <w:p>
@@ -37,7 +37,12 @@
     </w:p>
     <w:p>
       <w:r>
-        <w:t xml:space="preserve">- the current dated tester-share build remains `release/dungeon-dive-bad-decisions-android-tester-2026-04-08.apk`</w:t>
+        <w:t xml:space="preserve">- the dated April 14 handoff and APP_NEEDS `.docx` files now match the markdown source-of-truth again</w:t>
+      </w:r>
+    </w:p>
+    <w:p>
+      <w:r>
+        <w:t xml:space="preserve">- the latest dated outside-share build in the workspace is still `release/dungeon-dive-bad-decisions-android-tester-2026-04-08.apk`, but it does not represent the current rebooted repo state</w:t>
       </w:r>
     </w:p>
     <w:p>
@@ -54,17 +59,22 @@
     <w:p/>
     <w:p>
       <w:r>
-        <w:t xml:space="preserve">1. Share the April 8 tester APK with outside Android testers unless runtime source changes first.</w:t>
+        <w:t xml:space="preserve">1. Finish the rebooted vertical slice to the point where the first session feels sharp, readable, and replay-worthy on a real phone.</w:t>
       </w:r>
     </w:p>
     <w:p>
       <w:r>
-        <w:t xml:space="preserve">2. Run guided first-session tests on real phones.</w:t>
+        <w:t xml:space="preserve">2. Build a fresh tester APK only after the reboot slice is coherent enough to test honestly.</w:t>
       </w:r>
     </w:p>
     <w:p>
       <w:r>
-        <w:t xml:space="preserve">3. Capture only the evidence needed for the next decision:</w:t>
+        <w:t xml:space="preserve">3. Run guided first-session tests on real phones.</w:t>
+      </w:r>
+    </w:p>
+    <w:p>
+      <w:r>
+        <w:t xml:space="preserve">4. Capture only the evidence needed for the next decision:</w:t>
       </w:r>
     </w:p>
     <w:p>
@@ -94,12 +104,12 @@
     </w:p>
     <w:p>
       <w:r>
-        <w:t xml:space="preserve">4. Decide from evidence:</w:t>
+        <w:t xml:space="preserve">5. Decide from evidence:</w:t>
       </w:r>
     </w:p>
     <w:p>
       <w:r>
-        <w:t xml:space="preserve">   - confusion but interest: fix onboarding / clarity</w:t>
+        <w:t xml:space="preserve">   - confusion but interest: fix onboarding / clarity inside the reboot slice</w:t>
       </w:r>
     </w:p>
     <w:p>
@@ -109,17 +119,17 @@
     </w:p>
     <w:p>
       <w:r>
-        <w:t xml:space="preserve">   - understood but not compelling: consider deeper redesign or restart</w:t>
+        <w:t xml:space="preserve">   - understood but not compelling: consider a deeper redesign or restart</w:t>
       </w:r>
     </w:p>
     <w:p>
       <w:r>
-        <w:t xml:space="preserve">5. Finalize public support inbox, hosted privacy/support URLs if needed, Play listing assets, Data safety answers, and launch measurement/support stance.</w:t>
+        <w:t xml:space="preserve">6. Finalize public support inbox, hosted privacy/support URLs if needed, Play listing assets, Data safety answers, and launch measurement/support stance.</w:t>
       </w:r>
     </w:p>
     <w:p>
       <w:r>
-        <w:t xml:space="preserve">6. Fix only blocker bugs or compliance issues found during outside testing and store prep.</w:t>
+        <w:t xml:space="preserve">7. Fix only blocker bugs or compliance issues found during outside testing and store prep.</w:t>
       </w:r>
     </w:p>
     <w:p/>
@@ -131,17 +141,22 @@
     <w:p/>
     <w:p>
       <w:r>
-        <w:t xml:space="preserve">- do not start major new feature work</w:t>
+        <w:t xml:space="preserve">- do not treat the current legacy 10-floor runtime as the accepted launch shape</w:t>
       </w:r>
     </w:p>
     <w:p>
       <w:r>
-        <w:t xml:space="preserve">- do not create a fresh tester APK unless runtime source changes</w:t>
+        <w:t xml:space="preserve">- do not create a fresh tester APK until the reboot slice is coherent enough to test</w:t>
       </w:r>
     </w:p>
     <w:p>
       <w:r>
         <w:t xml:space="preserve">- do not lock a premium launch at `US$3.99` without outside proof</w:t>
+      </w:r>
+    </w:p>
+    <w:p>
+      <w:r>
+        <w:t xml:space="preserve">- do not expand content breadth to compensate for a weak core loop</w:t>
       </w:r>
     </w:p>
     <w:sectPr>

</xml_diff>